<commit_message>
Add shared song suggestion board
</commit_message>
<xml_diff>
--- a/public/Rad_Dad_Friends_Show_Packet_2026-09-19.docx
+++ b/public/Rad_Dad_Friends_Show_Packet_2026-09-19.docx
@@ -1539,9 +1539,9 @@
                 <w:b/>
                 <w:i w:val="0"/>
                 <w:color w:val="AAB7C0"/>
-                <w:sz w:val="13"/>
+                <w:sz w:val="12"/>
               </w:rPr>
-              <w:t>CURRENT WORKING ORDER  /  UPDATED AUGUST 9, 2026  /  1 OF 2</w:t>
+              <w:t>LIVE UPDATES: rad-dad-show-night.jeffstory007.chatgpt.site  /  UPDATED AUGUST 9, 2026  /  1 OF 2</w:t>
             </w:r>
           </w:p>
         </w:tc>
@@ -5159,9 +5159,9 @@
                 <w:b/>
                 <w:i w:val="0"/>
                 <w:color w:val="AAB7C0"/>
-                <w:sz w:val="13"/>
+                <w:sz w:val="12"/>
               </w:rPr>
-              <w:t>CURRENT WORKING ORDER  /  UPDATED AUGUST 9, 2026  /  2 OF 2</w:t>
+              <w:t>LIVE UPDATES: rad-dad-show-night.jeffstory007.chatgpt.site  /  UPDATED AUGUST 9, 2026  /  2 OF 2</w:t>
             </w:r>
           </w:p>
         </w:tc>

</xml_diff>